<commit_message>
Finalna verzija: pun trening (mIoU 0.80), transition matrica, ONNX export, demo tok, ispravke registracije i dokumentacije
</commit_message>
<xml_diff>
--- a/Dokumentacija/objasnjenje.docx
+++ b/Dokumentacija/objasnjenje.docx
@@ -303,7 +303,7 @@
           <w:sz w:val="24"/>
           <w:szCs w:val="24"/>
         </w:rPr>
-        <w:t>sopstvenim podacima</w:t>
+        <w:t>javno dostupnom datasetu</w:t>
       </w:r>
       <w:r>
         <w:rPr>
@@ -334,7 +334,7 @@
           <w:sz w:val="24"/>
           <w:szCs w:val="24"/>
         </w:rPr>
-        <w:t>Uzeli smo satelitske snimke Beograda iz 2016. i 2022. godine</w:t>
+        <w:t>Koristili smo DeepGlobe Land Cover Classification dataset (Kaggle) — 803 satelitske slike sa RGB-kodiranim maskama, koje smo remapirali u naše 4 klase</w:t>
       </w:r>
     </w:p>
     <w:p>
@@ -357,24 +357,24 @@
           <w:sz w:val="24"/>
           <w:szCs w:val="24"/>
         </w:rPr>
-        <w:t xml:space="preserve">Ručno anotirali u alatu </w:t>
-      </w:r>
-      <w:r>
-        <w:rPr>
-          <w:rFonts w:ascii="Times New Roman" w:eastAsia="Times New Roman" w:hAnsi="Times New Roman" w:cs="Times New Roman"/>
-          <w:bCs/>
-          <w:sz w:val="24"/>
-          <w:szCs w:val="24"/>
-        </w:rPr>
-        <w:t>CVAT</w:t>
-      </w:r>
-      <w:r>
-        <w:rPr>
-          <w:rFonts w:ascii="Times New Roman" w:eastAsia="Times New Roman" w:hAnsi="Times New Roman" w:cs="Times New Roman"/>
-          <w:sz w:val="24"/>
-          <w:szCs w:val="24"/>
-        </w:rPr>
-        <w:t xml:space="preserve"> — svaki piksel označen kao jedna od 4 klase: nepoznato, šuma, beton, polje</w:t>
+        <w:t xml:space="preserve">Maske su već bile anotirane u originalnom datasetu (7 klasa: urban, agriculture, rangeland, forest, water, barren, unknown), pa smo ih programski remapirali u naših 4 klase (nepoznato, šuma, beton, polje) — pristup </w:t>
+      </w:r>
+      <w:r>
+        <w:rPr>
+          <w:rFonts w:ascii="Times New Roman" w:eastAsia="Times New Roman" w:hAnsi="Times New Roman" w:cs="Times New Roman"/>
+          <w:bCs/>
+          <w:sz w:val="24"/>
+          <w:szCs w:val="24"/>
+        </w:rPr>
+        <w:t>alatom napisanim za konverziju boja u ID klase, ne ručnom anotacijom</w:t>
+      </w:r>
+      <w:r>
+        <w:rPr>
+          <w:rFonts w:ascii="Times New Roman" w:eastAsia="Times New Roman" w:hAnsi="Times New Roman" w:cs="Times New Roman"/>
+          <w:sz w:val="24"/>
+          <w:szCs w:val="24"/>
+        </w:rPr>
+        <w:t>.</w:t>
       </w:r>
     </w:p>
     <w:p>
@@ -414,7 +414,7 @@
           <w:sz w:val="24"/>
           <w:szCs w:val="24"/>
         </w:rPr>
-        <w:t xml:space="preserve"> (16 ukupno)</w:t>
+        <w:t xml:space="preserve"> (80.291 ukupno, sa 32px preklapanjem)</w:t>
       </w:r>
     </w:p>
     <w:p>
@@ -446,7 +446,7 @@
           <w:sz w:val="24"/>
           <w:szCs w:val="24"/>
         </w:rPr>
-        <w:t>48 epoha</w:t>
+        <w:t>39 epoha (early stopping, patience=10, maksimum 50)</w:t>
       </w:r>
       <w:r>
         <w:rPr>
@@ -571,15 +571,15 @@
           <w:sz w:val="24"/>
           <w:szCs w:val="24"/>
         </w:rPr>
-        <w:t>0.4966</w:t>
-      </w:r>
-      <w:r>
-        <w:rPr>
-          <w:rFonts w:ascii="Times New Roman" w:eastAsia="Times New Roman" w:hAnsi="Times New Roman" w:cs="Times New Roman"/>
-          <w:sz w:val="24"/>
-          <w:szCs w:val="24"/>
-        </w:rPr>
-        <w:t xml:space="preserve"> (50%)</w:t>
+        <w:t>0.8033</w:t>
+      </w:r>
+      <w:r>
+        <w:rPr>
+          <w:rFonts w:ascii="Times New Roman" w:eastAsia="Times New Roman" w:hAnsi="Times New Roman" w:cs="Times New Roman"/>
+          <w:sz w:val="24"/>
+          <w:szCs w:val="24"/>
+        </w:rPr>
+        <w:t xml:space="preserve"> (80%)</w:t>
       </w:r>
     </w:p>
     <w:p>
@@ -611,7 +611,7 @@
           <w:sz w:val="24"/>
           <w:szCs w:val="24"/>
         </w:rPr>
-        <w:t>70.57%</w:t>
+        <w:t>92.17%</w:t>
       </w:r>
     </w:p>
     <w:p>

</xml_diff>